<commit_message>
Doc 1 zadanie done
</commit_message>
<xml_diff>
--- a/lab1/labVad/lab_OS_1.docx
+++ b/lab1/labVad/lab_OS_1.docx
@@ -8221,6 +8221,7 @@
       </w:pPr>
       <w:r>
         <w:rPr>
+          <w:noProof/>
           <w:sz w:val="28"/>
           <w:szCs w:val="28"/>
         </w:rPr>
@@ -8593,6 +8594,7 @@
       </w:pPr>
       <w:r>
         <w:rPr>
+          <w:noProof/>
           <w:sz w:val="28"/>
           <w:szCs w:val="28"/>
         </w:rPr>
@@ -8730,6 +8732,7 @@
       </w:pPr>
       <w:r>
         <w:rPr>
+          <w:noProof/>
           <w:sz w:val="28"/>
           <w:szCs w:val="28"/>
         </w:rPr>
@@ -8807,6 +8810,7 @@
       </w:pPr>
       <w:r>
         <w:rPr>
+          <w:noProof/>
           <w:sz w:val="28"/>
           <w:szCs w:val="28"/>
         </w:rPr>
@@ -8910,6 +8914,7 @@
       </w:pPr>
       <w:r>
         <w:rPr>
+          <w:noProof/>
           <w:sz w:val="28"/>
           <w:szCs w:val="28"/>
         </w:rPr>
@@ -9152,7 +9157,6 @@
         <w:rPr>
           <w:sz w:val="28"/>
           <w:szCs w:val="28"/>
-          <w:lang w:val="en-US"/>
         </w:rPr>
         <w:t xml:space="preserve">) </w:t>
       </w:r>
@@ -10067,6 +10071,7 @@
       </w:pPr>
       <w:r>
         <w:rPr>
+          <w:noProof/>
           <w:sz w:val="28"/>
           <w:szCs w:val="28"/>
         </w:rPr>
@@ -10185,16 +10190,7 @@
           <w:sz w:val="28"/>
           <w:szCs w:val="28"/>
         </w:rPr>
-        <w:t>3</w:t>
-      </w:r>
-      <w:r>
-        <w:rPr>
-          <w:i/>
-          <w:iCs/>
-          <w:sz w:val="28"/>
-          <w:szCs w:val="28"/>
-        </w:rPr>
-        <w:t>9</w:t>
+        <w:t>39</w:t>
       </w:r>
     </w:p>
     <w:p>
@@ -10221,6 +10217,7 @@
       </w:pPr>
       <w:r>
         <w:rPr>
+          <w:noProof/>
           <w:sz w:val="28"/>
           <w:szCs w:val="28"/>
         </w:rPr>
@@ -10313,6 +10310,7 @@
       </w:pPr>
       <w:r>
         <w:rPr>
+          <w:noProof/>
           <w:sz w:val="28"/>
           <w:szCs w:val="28"/>
         </w:rPr>
@@ -10395,6 +10393,7 @@
       </w:pPr>
       <w:r>
         <w:rPr>
+          <w:noProof/>
           <w:sz w:val="28"/>
           <w:szCs w:val="28"/>
         </w:rPr>
@@ -10649,6 +10648,7 @@
       </w:pPr>
       <w:r>
         <w:rPr>
+          <w:noProof/>
           <w:sz w:val="28"/>
           <w:szCs w:val="28"/>
         </w:rPr>
@@ -10755,6 +10755,7 @@
       </w:pPr>
       <w:r>
         <w:rPr>
+          <w:noProof/>
           <w:sz w:val="28"/>
           <w:szCs w:val="28"/>
         </w:rPr>
@@ -10947,6 +10948,7 @@
       </w:r>
       <w:r>
         <w:rPr>
+          <w:noProof/>
           <w:sz w:val="28"/>
           <w:szCs w:val="28"/>
         </w:rPr>
@@ -11219,6 +11221,7 @@
       </w:pPr>
       <w:r>
         <w:rPr>
+          <w:noProof/>
           <w:sz w:val="28"/>
           <w:szCs w:val="28"/>
         </w:rPr>
@@ -11287,16 +11290,7 @@
           <w:sz w:val="28"/>
           <w:szCs w:val="28"/>
         </w:rPr>
-        <w:t>4</w:t>
-      </w:r>
-      <w:r>
-        <w:rPr>
-          <w:i/>
-          <w:iCs/>
-          <w:sz w:val="28"/>
-          <w:szCs w:val="28"/>
-        </w:rPr>
-        <w:t>7</w:t>
+        <w:t>47</w:t>
       </w:r>
     </w:p>
     <w:p>
@@ -11311,6 +11305,7 @@
       </w:pPr>
       <w:r>
         <w:rPr>
+          <w:noProof/>
           <w:sz w:val="28"/>
           <w:szCs w:val="28"/>
         </w:rPr>
@@ -11379,16 +11374,7 @@
           <w:sz w:val="28"/>
           <w:szCs w:val="28"/>
         </w:rPr>
-        <w:t>4</w:t>
-      </w:r>
-      <w:r>
-        <w:rPr>
-          <w:i/>
-          <w:iCs/>
-          <w:sz w:val="28"/>
-          <w:szCs w:val="28"/>
-        </w:rPr>
-        <w:t>8</w:t>
+        <w:t>48</w:t>
       </w:r>
     </w:p>
     <w:p>
@@ -11510,6 +11496,7 @@
       </w:pPr>
       <w:r>
         <w:rPr>
+          <w:noProof/>
           <w:sz w:val="28"/>
           <w:szCs w:val="28"/>
         </w:rPr>
@@ -11575,7 +11562,6 @@
         <w:rPr>
           <w:sz w:val="28"/>
           <w:szCs w:val="28"/>
-          <w:lang w:val="en-US"/>
         </w:rPr>
         <w:tab/>
       </w:r>
@@ -11615,21 +11601,7 @@
           <w:sz w:val="28"/>
           <w:szCs w:val="28"/>
         </w:rPr>
-        <w:t xml:space="preserve"> Функция выводит информацию о дате создания, изменения и открытия </w:t>
-      </w:r>
-      <w:r>
-        <w:rPr>
-          <w:sz w:val="28"/>
-          <w:szCs w:val="28"/>
-        </w:rPr>
-        <w:t>файла</w:t>
-      </w:r>
-      <w:r>
-        <w:rPr>
-          <w:sz w:val="28"/>
-          <w:szCs w:val="28"/>
-        </w:rPr>
-        <w:t xml:space="preserve">. Сделано это через функцию </w:t>
+        <w:t xml:space="preserve"> Функция выводит информацию о дате создания, изменения и открытия файла. Сделано это через функцию </w:t>
       </w:r>
       <w:proofErr w:type="spellStart"/>
       <w:r>
@@ -11710,6 +11682,7 @@
       </w:pPr>
       <w:r>
         <w:rPr>
+          <w:noProof/>
           <w:sz w:val="28"/>
           <w:szCs w:val="28"/>
         </w:rPr>
@@ -11787,16 +11760,7 @@
           <w:sz w:val="28"/>
           <w:szCs w:val="28"/>
         </w:rPr>
-        <w:t>4</w:t>
-      </w:r>
-      <w:r>
-        <w:rPr>
-          <w:i/>
-          <w:iCs/>
-          <w:sz w:val="28"/>
-          <w:szCs w:val="28"/>
-        </w:rPr>
-        <w:t>9</w:t>
+        <w:t>49</w:t>
       </w:r>
     </w:p>
     <w:p>
@@ -11984,6 +11948,7 @@
       </w:pPr>
       <w:r>
         <w:rPr>
+          <w:noProof/>
           <w:sz w:val="28"/>
           <w:szCs w:val="28"/>
         </w:rPr>
@@ -12231,6 +12196,7 @@
       </w:pPr>
       <w:r>
         <w:rPr>
+          <w:noProof/>
           <w:sz w:val="28"/>
           <w:szCs w:val="28"/>
         </w:rPr>
@@ -12501,6 +12467,7 @@
       </w:pPr>
       <w:r>
         <w:rPr>
+          <w:noProof/>
           <w:sz w:val="28"/>
           <w:szCs w:val="28"/>
         </w:rPr>
@@ -12705,6 +12672,7 @@
       </w:pPr>
       <w:r>
         <w:rPr>
+          <w:noProof/>
           <w:sz w:val="28"/>
           <w:szCs w:val="28"/>
         </w:rPr>
@@ -12983,6 +12951,577 @@
           <w:szCs w:val="28"/>
         </w:rPr>
       </w:pPr>
+    </w:p>
+    <w:p>
+      <w:pPr>
+        <w:pStyle w:val="Standard"/>
+        <w:spacing w:line="360" w:lineRule="auto"/>
+        <w:jc w:val="both"/>
+        <w:rPr>
+          <w:sz w:val="28"/>
+          <w:szCs w:val="28"/>
+        </w:rPr>
+      </w:pPr>
+    </w:p>
+    <w:p>
+      <w:pPr>
+        <w:pStyle w:val="Standard"/>
+        <w:spacing w:line="360" w:lineRule="auto"/>
+        <w:jc w:val="both"/>
+        <w:rPr>
+          <w:sz w:val="28"/>
+          <w:szCs w:val="28"/>
+        </w:rPr>
+      </w:pPr>
+    </w:p>
+    <w:p>
+      <w:pPr>
+        <w:pStyle w:val="Standard"/>
+        <w:spacing w:line="360" w:lineRule="auto"/>
+        <w:jc w:val="both"/>
+        <w:rPr>
+          <w:sz w:val="28"/>
+          <w:szCs w:val="28"/>
+        </w:rPr>
+      </w:pPr>
+    </w:p>
+    <w:p>
+      <w:pPr>
+        <w:pStyle w:val="Standard"/>
+        <w:spacing w:line="360" w:lineRule="auto"/>
+        <w:jc w:val="both"/>
+        <w:rPr>
+          <w:b/>
+          <w:bCs/>
+          <w:sz w:val="32"/>
+          <w:szCs w:val="32"/>
+        </w:rPr>
+      </w:pPr>
+      <w:r>
+        <w:rPr>
+          <w:b/>
+          <w:bCs/>
+          <w:sz w:val="32"/>
+          <w:szCs w:val="32"/>
+        </w:rPr>
+        <w:lastRenderedPageBreak/>
+        <w:t>Выводы по заданию 1.1</w:t>
+      </w:r>
+    </w:p>
+    <w:p>
+      <w:pPr>
+        <w:pStyle w:val="Standard"/>
+        <w:spacing w:line="360" w:lineRule="auto"/>
+        <w:ind w:firstLine="720"/>
+        <w:jc w:val="both"/>
+        <w:rPr>
+          <w:sz w:val="28"/>
+          <w:szCs w:val="28"/>
+        </w:rPr>
+      </w:pPr>
+      <w:r>
+        <w:rPr>
+          <w:sz w:val="28"/>
+          <w:szCs w:val="28"/>
+        </w:rPr>
+        <w:t>В ходе выполнения первой части лабораторной работы было разработано консольное приложение, демонстрирующее возможности Win32 API по управлению файловой системой Windows. Реализованы функции для вывода списка дисков с использованием </w:t>
+      </w:r>
+      <w:proofErr w:type="spellStart"/>
+      <w:r>
+        <w:rPr>
+          <w:i/>
+          <w:iCs/>
+          <w:sz w:val="28"/>
+          <w:szCs w:val="28"/>
+        </w:rPr>
+        <w:t>GetLogicalDrives</w:t>
+      </w:r>
+      <w:proofErr w:type="spellEnd"/>
+      <w:r>
+        <w:rPr>
+          <w:sz w:val="28"/>
+          <w:szCs w:val="28"/>
+        </w:rPr>
+        <w:t> и </w:t>
+      </w:r>
+      <w:proofErr w:type="spellStart"/>
+      <w:r>
+        <w:rPr>
+          <w:i/>
+          <w:iCs/>
+          <w:sz w:val="28"/>
+          <w:szCs w:val="28"/>
+        </w:rPr>
+        <w:t>GetLogicalDriveStrings</w:t>
+      </w:r>
+      <w:proofErr w:type="spellEnd"/>
+      <w:r>
+        <w:rPr>
+          <w:sz w:val="28"/>
+          <w:szCs w:val="28"/>
+        </w:rPr>
+        <w:t>, определения типа носителя через </w:t>
+      </w:r>
+      <w:proofErr w:type="spellStart"/>
+      <w:r>
+        <w:rPr>
+          <w:i/>
+          <w:iCs/>
+          <w:sz w:val="28"/>
+          <w:szCs w:val="28"/>
+        </w:rPr>
+        <w:t>GetDriveType</w:t>
+      </w:r>
+      <w:proofErr w:type="spellEnd"/>
+      <w:r>
+        <w:rPr>
+          <w:sz w:val="28"/>
+          <w:szCs w:val="28"/>
+        </w:rPr>
+        <w:t xml:space="preserve">, получения детальной информации о файловой системе </w:t>
+      </w:r>
+      <w:proofErr w:type="spellStart"/>
+      <w:r>
+        <w:rPr>
+          <w:i/>
+          <w:iCs/>
+          <w:sz w:val="28"/>
+          <w:szCs w:val="28"/>
+        </w:rPr>
+        <w:t>GetVolumeInformatio</w:t>
+      </w:r>
+      <w:proofErr w:type="spellEnd"/>
+      <w:r>
+        <w:rPr>
+          <w:i/>
+          <w:iCs/>
+          <w:sz w:val="28"/>
+          <w:szCs w:val="28"/>
+          <w:lang w:val="en-US"/>
+        </w:rPr>
+        <w:t>n</w:t>
+      </w:r>
+      <w:r>
+        <w:rPr>
+          <w:sz w:val="28"/>
+          <w:szCs w:val="28"/>
+        </w:rPr>
+        <w:t xml:space="preserve"> и свободном пространстве </w:t>
+      </w:r>
+      <w:proofErr w:type="spellStart"/>
+      <w:r>
+        <w:rPr>
+          <w:i/>
+          <w:iCs/>
+          <w:sz w:val="28"/>
+          <w:szCs w:val="28"/>
+        </w:rPr>
+        <w:t>GetDiskFreeSpace</w:t>
+      </w:r>
+      <w:proofErr w:type="spellEnd"/>
+      <w:r>
+        <w:rPr>
+          <w:sz w:val="28"/>
+          <w:szCs w:val="28"/>
+        </w:rPr>
+        <w:t>. Создание и удаление каталогов выполнены с помощью </w:t>
+      </w:r>
+      <w:proofErr w:type="spellStart"/>
+      <w:r>
+        <w:rPr>
+          <w:i/>
+          <w:iCs/>
+          <w:sz w:val="28"/>
+          <w:szCs w:val="28"/>
+        </w:rPr>
+        <w:t>CreateDirectory</w:t>
+      </w:r>
+      <w:proofErr w:type="spellEnd"/>
+      <w:r>
+        <w:rPr>
+          <w:sz w:val="28"/>
+          <w:szCs w:val="28"/>
+        </w:rPr>
+        <w:t> и </w:t>
+      </w:r>
+      <w:proofErr w:type="spellStart"/>
+      <w:r>
+        <w:rPr>
+          <w:i/>
+          <w:iCs/>
+          <w:sz w:val="28"/>
+          <w:szCs w:val="28"/>
+        </w:rPr>
+        <w:t>RemoveDirectory</w:t>
+      </w:r>
+      <w:proofErr w:type="spellEnd"/>
+      <w:r>
+        <w:rPr>
+          <w:sz w:val="28"/>
+          <w:szCs w:val="28"/>
+        </w:rPr>
+        <w:t> с добавленными проверками существования пути и обработкой ошибок. Для работы с файлами использованы </w:t>
+      </w:r>
+      <w:proofErr w:type="spellStart"/>
+      <w:r>
+        <w:rPr>
+          <w:i/>
+          <w:iCs/>
+          <w:sz w:val="28"/>
+          <w:szCs w:val="28"/>
+        </w:rPr>
+        <w:t>CreateFile</w:t>
+      </w:r>
+      <w:proofErr w:type="spellEnd"/>
+      <w:r>
+        <w:rPr>
+          <w:sz w:val="28"/>
+          <w:szCs w:val="28"/>
+        </w:rPr>
+        <w:t> для создания файлов с возможностью записи данных, </w:t>
+      </w:r>
+      <w:proofErr w:type="spellStart"/>
+      <w:r>
+        <w:rPr>
+          <w:i/>
+          <w:iCs/>
+          <w:sz w:val="28"/>
+          <w:szCs w:val="28"/>
+        </w:rPr>
+        <w:t>CopyFile</w:t>
+      </w:r>
+      <w:proofErr w:type="spellEnd"/>
+      <w:r>
+        <w:rPr>
+          <w:sz w:val="28"/>
+          <w:szCs w:val="28"/>
+        </w:rPr>
+        <w:t> для копирования с опцией перезаписи существующего файла, а также </w:t>
+      </w:r>
+      <w:proofErr w:type="spellStart"/>
+      <w:r>
+        <w:rPr>
+          <w:i/>
+          <w:iCs/>
+          <w:sz w:val="28"/>
+          <w:szCs w:val="28"/>
+        </w:rPr>
+        <w:t>MoveFile</w:t>
+      </w:r>
+      <w:proofErr w:type="spellEnd"/>
+      <w:r>
+        <w:rPr>
+          <w:sz w:val="28"/>
+          <w:szCs w:val="28"/>
+        </w:rPr>
+        <w:t> и </w:t>
+      </w:r>
+      <w:proofErr w:type="spellStart"/>
+      <w:r>
+        <w:rPr>
+          <w:i/>
+          <w:iCs/>
+          <w:sz w:val="28"/>
+          <w:szCs w:val="28"/>
+        </w:rPr>
+        <w:t>MoveFileEx</w:t>
+      </w:r>
+      <w:proofErr w:type="spellEnd"/>
+      <w:r>
+        <w:rPr>
+          <w:sz w:val="28"/>
+          <w:szCs w:val="28"/>
+        </w:rPr>
+        <w:t> для перемещения, где расширенная версия позволяет перезаписывать файлы и перемещать их между разными дисками с помощью флагов. Анализ и изменение атрибутов реализованы через </w:t>
+      </w:r>
+      <w:proofErr w:type="spellStart"/>
+      <w:r>
+        <w:rPr>
+          <w:sz w:val="28"/>
+          <w:szCs w:val="28"/>
+        </w:rPr>
+        <w:t>GetFileAttributes</w:t>
+      </w:r>
+      <w:proofErr w:type="spellEnd"/>
+      <w:r>
+        <w:rPr>
+          <w:sz w:val="28"/>
+          <w:szCs w:val="28"/>
+        </w:rPr>
+        <w:t> и </w:t>
+      </w:r>
+      <w:proofErr w:type="spellStart"/>
+      <w:r>
+        <w:rPr>
+          <w:sz w:val="28"/>
+          <w:szCs w:val="28"/>
+        </w:rPr>
+        <w:t>SetFileAttributes</w:t>
+      </w:r>
+      <w:proofErr w:type="spellEnd"/>
+      <w:r>
+        <w:rPr>
+          <w:sz w:val="28"/>
+          <w:szCs w:val="28"/>
+        </w:rPr>
+        <w:t>, а получение временных меток и детальной информации о файле — через </w:t>
+      </w:r>
+      <w:proofErr w:type="spellStart"/>
+      <w:r>
+        <w:rPr>
+          <w:i/>
+          <w:iCs/>
+          <w:sz w:val="28"/>
+          <w:szCs w:val="28"/>
+        </w:rPr>
+        <w:t>GetFileTime</w:t>
+      </w:r>
+      <w:proofErr w:type="spellEnd"/>
+      <w:r>
+        <w:rPr>
+          <w:sz w:val="28"/>
+          <w:szCs w:val="28"/>
+        </w:rPr>
+        <w:t>, </w:t>
+      </w:r>
+      <w:proofErr w:type="spellStart"/>
+      <w:r>
+        <w:rPr>
+          <w:i/>
+          <w:iCs/>
+          <w:sz w:val="28"/>
+          <w:szCs w:val="28"/>
+        </w:rPr>
+        <w:t>SetFileTime</w:t>
+      </w:r>
+      <w:proofErr w:type="spellEnd"/>
+      <w:r>
+        <w:rPr>
+          <w:sz w:val="28"/>
+          <w:szCs w:val="28"/>
+        </w:rPr>
+        <w:t> и </w:t>
+      </w:r>
+      <w:proofErr w:type="spellStart"/>
+      <w:r>
+        <w:rPr>
+          <w:i/>
+          <w:iCs/>
+          <w:sz w:val="28"/>
+          <w:szCs w:val="28"/>
+        </w:rPr>
+        <w:t>GetFileInformationByHandle</w:t>
+      </w:r>
+      <w:proofErr w:type="spellEnd"/>
+      <w:r>
+        <w:rPr>
+          <w:sz w:val="28"/>
+          <w:szCs w:val="28"/>
+        </w:rPr>
+        <w:t xml:space="preserve">. </w:t>
+      </w:r>
+    </w:p>
+    <w:p>
+      <w:pPr>
+        <w:pStyle w:val="Standard"/>
+        <w:spacing w:line="360" w:lineRule="auto"/>
+        <w:ind w:firstLine="720"/>
+        <w:jc w:val="both"/>
+        <w:rPr>
+          <w:sz w:val="28"/>
+          <w:szCs w:val="28"/>
+        </w:rPr>
+      </w:pPr>
+      <w:r>
+        <w:rPr>
+          <w:sz w:val="28"/>
+          <w:szCs w:val="28"/>
+        </w:rPr>
+        <w:t xml:space="preserve">В процессе разработки были выявлены следующие особенности Win32 API: </w:t>
+      </w:r>
+    </w:p>
+    <w:p>
+      <w:pPr>
+        <w:pStyle w:val="Standard"/>
+        <w:numPr>
+          <w:ilvl w:val="0"/>
+          <w:numId w:val="12"/>
+        </w:numPr>
+        <w:spacing w:line="360" w:lineRule="auto"/>
+        <w:jc w:val="both"/>
+        <w:rPr>
+          <w:sz w:val="28"/>
+          <w:szCs w:val="28"/>
+        </w:rPr>
+      </w:pPr>
+      <w:r>
+        <w:rPr>
+          <w:sz w:val="28"/>
+          <w:szCs w:val="28"/>
+        </w:rPr>
+        <w:t>функция </w:t>
+      </w:r>
+      <w:proofErr w:type="spellStart"/>
+      <w:r>
+        <w:rPr>
+          <w:i/>
+          <w:iCs/>
+          <w:sz w:val="28"/>
+          <w:szCs w:val="28"/>
+        </w:rPr>
+        <w:t>MoveFile</w:t>
+      </w:r>
+      <w:proofErr w:type="spellEnd"/>
+      <w:r>
+        <w:rPr>
+          <w:sz w:val="28"/>
+          <w:szCs w:val="28"/>
+        </w:rPr>
+        <w:t> не поддерживает перемещение между разными томами, для этого требуется </w:t>
+      </w:r>
+      <w:proofErr w:type="spellStart"/>
+      <w:r>
+        <w:rPr>
+          <w:i/>
+          <w:iCs/>
+          <w:sz w:val="28"/>
+          <w:szCs w:val="28"/>
+        </w:rPr>
+        <w:t>MoveFileEx</w:t>
+      </w:r>
+      <w:proofErr w:type="spellEnd"/>
+      <w:r>
+        <w:rPr>
+          <w:sz w:val="28"/>
+          <w:szCs w:val="28"/>
+        </w:rPr>
+        <w:t xml:space="preserve"> с флагом MOVEFILE_COPY_ALLOWED; </w:t>
+      </w:r>
+    </w:p>
+    <w:p>
+      <w:pPr>
+        <w:pStyle w:val="Standard"/>
+        <w:numPr>
+          <w:ilvl w:val="0"/>
+          <w:numId w:val="12"/>
+        </w:numPr>
+        <w:spacing w:line="360" w:lineRule="auto"/>
+        <w:jc w:val="both"/>
+        <w:rPr>
+          <w:sz w:val="28"/>
+          <w:szCs w:val="28"/>
+        </w:rPr>
+      </w:pPr>
+      <w:r>
+        <w:rPr>
+          <w:sz w:val="28"/>
+          <w:szCs w:val="28"/>
+        </w:rPr>
+        <w:t>при передаче пути к директории без указания имени файла </w:t>
+      </w:r>
+      <w:proofErr w:type="spellStart"/>
+      <w:r>
+        <w:rPr>
+          <w:i/>
+          <w:iCs/>
+          <w:sz w:val="28"/>
+          <w:szCs w:val="28"/>
+        </w:rPr>
+        <w:t>MoveFileEx</w:t>
+      </w:r>
+      <w:proofErr w:type="spellEnd"/>
+      <w:r>
+        <w:rPr>
+          <w:sz w:val="28"/>
+          <w:szCs w:val="28"/>
+        </w:rPr>
+        <w:t> возвращает ошибку ERROR_ALREADY_EXISTS;</w:t>
+      </w:r>
+    </w:p>
+    <w:p>
+      <w:pPr>
+        <w:pStyle w:val="Standard"/>
+        <w:numPr>
+          <w:ilvl w:val="0"/>
+          <w:numId w:val="12"/>
+        </w:numPr>
+        <w:spacing w:line="360" w:lineRule="auto"/>
+        <w:jc w:val="both"/>
+        <w:rPr>
+          <w:sz w:val="28"/>
+          <w:szCs w:val="28"/>
+        </w:rPr>
+      </w:pPr>
+      <w:r>
+        <w:rPr>
+          <w:sz w:val="28"/>
+          <w:szCs w:val="28"/>
+        </w:rPr>
+        <w:lastRenderedPageBreak/>
+        <w:t xml:space="preserve">атрибуты FILE_ATTRIBUTE_TEMPORARY и FILE_ATTRIBUTE_COMPRESSED не устанавливаются автоматически на основе расширения файла, а должны быть явно заданы; </w:t>
+      </w:r>
+    </w:p>
+    <w:p>
+      <w:pPr>
+        <w:pStyle w:val="Standard"/>
+        <w:numPr>
+          <w:ilvl w:val="0"/>
+          <w:numId w:val="12"/>
+        </w:numPr>
+        <w:spacing w:line="360" w:lineRule="auto"/>
+        <w:jc w:val="both"/>
+        <w:rPr>
+          <w:sz w:val="28"/>
+          <w:szCs w:val="28"/>
+        </w:rPr>
+      </w:pPr>
+      <w:r>
+        <w:rPr>
+          <w:sz w:val="28"/>
+          <w:szCs w:val="28"/>
+        </w:rPr>
+        <w:t xml:space="preserve">для выполнения операций с флагом MOVEFILE_REPLACE_EXISTING и установки системных атрибутов требуются права администратора, иначе API возвращает ERROR_ACCESS_DENIED; </w:t>
+      </w:r>
+    </w:p>
+    <w:p>
+      <w:pPr>
+        <w:pStyle w:val="Standard"/>
+        <w:numPr>
+          <w:ilvl w:val="0"/>
+          <w:numId w:val="12"/>
+        </w:numPr>
+        <w:spacing w:line="360" w:lineRule="auto"/>
+        <w:jc w:val="both"/>
+        <w:rPr>
+          <w:sz w:val="28"/>
+          <w:szCs w:val="28"/>
+        </w:rPr>
+      </w:pPr>
+      <w:r>
+        <w:rPr>
+          <w:sz w:val="28"/>
+          <w:szCs w:val="28"/>
+        </w:rPr>
+        <w:t>временные метки FILETIME имеют высокую точность до 100 наносекунд.</w:t>
+      </w:r>
+    </w:p>
+    <w:p>
+      <w:pPr>
+        <w:pStyle w:val="Standard"/>
+        <w:spacing w:line="360" w:lineRule="auto"/>
+        <w:jc w:val="both"/>
+        <w:rPr>
+          <w:sz w:val="28"/>
+          <w:szCs w:val="28"/>
+        </w:rPr>
+      </w:pPr>
+      <w:r>
+        <w:rPr>
+          <w:sz w:val="28"/>
+          <w:szCs w:val="28"/>
+        </w:rPr>
+        <w:t>Все эти особенности были учтены при разработке, что позволило создать стабильное приложение, корректно обрабатывающее все исключительные ситуации.</w:t>
+      </w:r>
     </w:p>
     <w:sectPr>
       <w:headerReference w:type="default" r:id="rId61"/>
@@ -13825,6 +14364,178 @@
     </w:lvl>
   </w:abstractNum>
   <w:abstractNum w:abstractNumId="3" w15:restartNumberingAfterBreak="0">
+    <w:nsid w:val="13927B2A"/>
+    <w:multiLevelType w:val="hybridMultilevel"/>
+    <w:tmpl w:val="87949BEE"/>
+    <w:lvl w:ilvl="0" w:tplc="0419000F">
+      <w:start w:val="1"/>
+      <w:numFmt w:val="decimal"/>
+      <w:lvlText w:val="%1."/>
+      <w:lvlJc w:val="left"/>
+      <w:pPr>
+        <w:ind w:left="360" w:hanging="360"/>
+      </w:pPr>
+    </w:lvl>
+    <w:lvl w:ilvl="1" w:tplc="04190019" w:tentative="1">
+      <w:start w:val="1"/>
+      <w:numFmt w:val="lowerLetter"/>
+      <w:lvlText w:val="%2."/>
+      <w:lvlJc w:val="left"/>
+      <w:pPr>
+        <w:ind w:left="1080" w:hanging="360"/>
+      </w:pPr>
+    </w:lvl>
+    <w:lvl w:ilvl="2" w:tplc="0419001B" w:tentative="1">
+      <w:start w:val="1"/>
+      <w:numFmt w:val="lowerRoman"/>
+      <w:lvlText w:val="%3."/>
+      <w:lvlJc w:val="right"/>
+      <w:pPr>
+        <w:ind w:left="1800" w:hanging="180"/>
+      </w:pPr>
+    </w:lvl>
+    <w:lvl w:ilvl="3" w:tplc="0419000F" w:tentative="1">
+      <w:start w:val="1"/>
+      <w:numFmt w:val="decimal"/>
+      <w:lvlText w:val="%4."/>
+      <w:lvlJc w:val="left"/>
+      <w:pPr>
+        <w:ind w:left="2520" w:hanging="360"/>
+      </w:pPr>
+    </w:lvl>
+    <w:lvl w:ilvl="4" w:tplc="04190019" w:tentative="1">
+      <w:start w:val="1"/>
+      <w:numFmt w:val="lowerLetter"/>
+      <w:lvlText w:val="%5."/>
+      <w:lvlJc w:val="left"/>
+      <w:pPr>
+        <w:ind w:left="3240" w:hanging="360"/>
+      </w:pPr>
+    </w:lvl>
+    <w:lvl w:ilvl="5" w:tplc="0419001B" w:tentative="1">
+      <w:start w:val="1"/>
+      <w:numFmt w:val="lowerRoman"/>
+      <w:lvlText w:val="%6."/>
+      <w:lvlJc w:val="right"/>
+      <w:pPr>
+        <w:ind w:left="3960" w:hanging="180"/>
+      </w:pPr>
+    </w:lvl>
+    <w:lvl w:ilvl="6" w:tplc="0419000F" w:tentative="1">
+      <w:start w:val="1"/>
+      <w:numFmt w:val="decimal"/>
+      <w:lvlText w:val="%7."/>
+      <w:lvlJc w:val="left"/>
+      <w:pPr>
+        <w:ind w:left="4680" w:hanging="360"/>
+      </w:pPr>
+    </w:lvl>
+    <w:lvl w:ilvl="7" w:tplc="04190019" w:tentative="1">
+      <w:start w:val="1"/>
+      <w:numFmt w:val="lowerLetter"/>
+      <w:lvlText w:val="%8."/>
+      <w:lvlJc w:val="left"/>
+      <w:pPr>
+        <w:ind w:left="5400" w:hanging="360"/>
+      </w:pPr>
+    </w:lvl>
+    <w:lvl w:ilvl="8" w:tplc="0419001B" w:tentative="1">
+      <w:start w:val="1"/>
+      <w:numFmt w:val="lowerRoman"/>
+      <w:lvlText w:val="%9."/>
+      <w:lvlJc w:val="right"/>
+      <w:pPr>
+        <w:ind w:left="6120" w:hanging="180"/>
+      </w:pPr>
+    </w:lvl>
+  </w:abstractNum>
+  <w:abstractNum w:abstractNumId="4" w15:restartNumberingAfterBreak="0">
+    <w:nsid w:val="22CC2439"/>
+    <w:multiLevelType w:val="hybridMultilevel"/>
+    <w:tmpl w:val="B1E4252E"/>
+    <w:lvl w:ilvl="0" w:tplc="0419000F">
+      <w:start w:val="1"/>
+      <w:numFmt w:val="decimal"/>
+      <w:lvlText w:val="%1."/>
+      <w:lvlJc w:val="left"/>
+      <w:pPr>
+        <w:ind w:left="360" w:hanging="360"/>
+      </w:pPr>
+    </w:lvl>
+    <w:lvl w:ilvl="1" w:tplc="04190019" w:tentative="1">
+      <w:start w:val="1"/>
+      <w:numFmt w:val="lowerLetter"/>
+      <w:lvlText w:val="%2."/>
+      <w:lvlJc w:val="left"/>
+      <w:pPr>
+        <w:ind w:left="1080" w:hanging="360"/>
+      </w:pPr>
+    </w:lvl>
+    <w:lvl w:ilvl="2" w:tplc="0419001B" w:tentative="1">
+      <w:start w:val="1"/>
+      <w:numFmt w:val="lowerRoman"/>
+      <w:lvlText w:val="%3."/>
+      <w:lvlJc w:val="right"/>
+      <w:pPr>
+        <w:ind w:left="1800" w:hanging="180"/>
+      </w:pPr>
+    </w:lvl>
+    <w:lvl w:ilvl="3" w:tplc="0419000F" w:tentative="1">
+      <w:start w:val="1"/>
+      <w:numFmt w:val="decimal"/>
+      <w:lvlText w:val="%4."/>
+      <w:lvlJc w:val="left"/>
+      <w:pPr>
+        <w:ind w:left="2520" w:hanging="360"/>
+      </w:pPr>
+    </w:lvl>
+    <w:lvl w:ilvl="4" w:tplc="04190019" w:tentative="1">
+      <w:start w:val="1"/>
+      <w:numFmt w:val="lowerLetter"/>
+      <w:lvlText w:val="%5."/>
+      <w:lvlJc w:val="left"/>
+      <w:pPr>
+        <w:ind w:left="3240" w:hanging="360"/>
+      </w:pPr>
+    </w:lvl>
+    <w:lvl w:ilvl="5" w:tplc="0419001B" w:tentative="1">
+      <w:start w:val="1"/>
+      <w:numFmt w:val="lowerRoman"/>
+      <w:lvlText w:val="%6."/>
+      <w:lvlJc w:val="right"/>
+      <w:pPr>
+        <w:ind w:left="3960" w:hanging="180"/>
+      </w:pPr>
+    </w:lvl>
+    <w:lvl w:ilvl="6" w:tplc="0419000F" w:tentative="1">
+      <w:start w:val="1"/>
+      <w:numFmt w:val="decimal"/>
+      <w:lvlText w:val="%7."/>
+      <w:lvlJc w:val="left"/>
+      <w:pPr>
+        <w:ind w:left="4680" w:hanging="360"/>
+      </w:pPr>
+    </w:lvl>
+    <w:lvl w:ilvl="7" w:tplc="04190019" w:tentative="1">
+      <w:start w:val="1"/>
+      <w:numFmt w:val="lowerLetter"/>
+      <w:lvlText w:val="%8."/>
+      <w:lvlJc w:val="left"/>
+      <w:pPr>
+        <w:ind w:left="5400" w:hanging="360"/>
+      </w:pPr>
+    </w:lvl>
+    <w:lvl w:ilvl="8" w:tplc="0419001B" w:tentative="1">
+      <w:start w:val="1"/>
+      <w:numFmt w:val="lowerRoman"/>
+      <w:lvlText w:val="%9."/>
+      <w:lvlJc w:val="right"/>
+      <w:pPr>
+        <w:ind w:left="6120" w:hanging="180"/>
+      </w:pPr>
+    </w:lvl>
+  </w:abstractNum>
+  <w:abstractNum w:abstractNumId="5" w15:restartNumberingAfterBreak="0">
     <w:nsid w:val="343F1F26"/>
     <w:multiLevelType w:val="hybridMultilevel"/>
     <w:tmpl w:val="508C71AA"/>
@@ -14037,7 +14748,7 @@
       </w:rPr>
     </w:lvl>
   </w:abstractNum>
-  <w:abstractNum w:abstractNumId="4" w15:restartNumberingAfterBreak="0">
+  <w:abstractNum w:abstractNumId="6" w15:restartNumberingAfterBreak="0">
     <w:nsid w:val="3E214886"/>
     <w:multiLevelType w:val="hybridMultilevel"/>
     <w:tmpl w:val="81FE7F7E"/>
@@ -14123,7 +14834,7 @@
       </w:pPr>
     </w:lvl>
   </w:abstractNum>
-  <w:abstractNum w:abstractNumId="5" w15:restartNumberingAfterBreak="0">
+  <w:abstractNum w:abstractNumId="7" w15:restartNumberingAfterBreak="0">
     <w:nsid w:val="44053B93"/>
     <w:multiLevelType w:val="multilevel"/>
     <w:tmpl w:val="5EF2C60C"/>
@@ -14236,7 +14947,7 @@
       </w:pPr>
     </w:lvl>
   </w:abstractNum>
-  <w:abstractNum w:abstractNumId="6" w15:restartNumberingAfterBreak="0">
+  <w:abstractNum w:abstractNumId="8" w15:restartNumberingAfterBreak="0">
     <w:nsid w:val="682B7E4C"/>
     <w:multiLevelType w:val="hybridMultilevel"/>
     <w:tmpl w:val="B942CCFE"/>
@@ -14325,7 +15036,7 @@
       </w:pPr>
     </w:lvl>
   </w:abstractNum>
-  <w:abstractNum w:abstractNumId="7" w15:restartNumberingAfterBreak="0">
+  <w:abstractNum w:abstractNumId="9" w15:restartNumberingAfterBreak="0">
     <w:nsid w:val="6AAF15EF"/>
     <w:multiLevelType w:val="hybridMultilevel"/>
     <w:tmpl w:val="2AFC9368"/>
@@ -14539,16 +15250,16 @@
     </w:lvl>
   </w:abstractNum>
   <w:num w:numId="1">
-    <w:abstractNumId w:val="3"/>
+    <w:abstractNumId w:val="5"/>
   </w:num>
   <w:num w:numId="2">
     <w:abstractNumId w:val="2"/>
   </w:num>
   <w:num w:numId="3">
-    <w:abstractNumId w:val="6"/>
+    <w:abstractNumId w:val="8"/>
   </w:num>
   <w:num w:numId="4">
-    <w:abstractNumId w:val="3"/>
+    <w:abstractNumId w:val="5"/>
     <w:lvlOverride w:ilvl="0">
       <w:startOverride w:val="1"/>
     </w:lvlOverride>
@@ -14595,13 +15306,13 @@
     <w:abstractNumId w:val="1"/>
   </w:num>
   <w:num w:numId="7">
-    <w:abstractNumId w:val="7"/>
+    <w:abstractNumId w:val="9"/>
   </w:num>
   <w:num w:numId="8">
     <w:abstractNumId w:val="0"/>
   </w:num>
   <w:num w:numId="9">
-    <w:abstractNumId w:val="4"/>
+    <w:abstractNumId w:val="6"/>
     <w:lvlOverride w:ilvl="0">
       <w:startOverride w:val="1"/>
     </w:lvlOverride>
@@ -14631,7 +15342,13 @@
     </w:lvlOverride>
   </w:num>
   <w:num w:numId="10">
-    <w:abstractNumId w:val="5"/>
+    <w:abstractNumId w:val="7"/>
+  </w:num>
+  <w:num w:numId="11">
+    <w:abstractNumId w:val="4"/>
+  </w:num>
+  <w:num w:numId="12">
+    <w:abstractNumId w:val="3"/>
   </w:num>
 </w:numbering>
 </file>

</xml_diff>